<commit_message>
change to reproduce results
</commit_message>
<xml_diff>
--- a/teoria.docx
+++ b/teoria.docx
@@ -12,23 +12,24 @@
         <w:rPr>
           <w:lang w:val="es-ES_tradnl"/>
         </w:rPr>
-        <w:t>SLIM + ABS:</w:t>
+        <w:t>SLIM+ABS:</w:t>
       </w:r>
+    </w:p>
+    <w:p>
+      <w:pPr>
+        <w:rPr>
+          <w:lang w:val="es-ES_tradnl"/>
+        </w:rPr>
+      </w:pPr>
       <w:r>
         <w:rPr>
           <w:lang w:val="es-ES_tradnl"/>
         </w:rPr>
-        <w:br/>
-      </w:r>
-      <w:r>
-        <w:rPr>
-          <w:lang w:val="es-ES_tradnl"/>
-        </w:rPr>
         <w:drawing>
-          <wp:inline distT="0" distB="0" distL="0" distR="0" wp14:anchorId="25378CEF" wp14:editId="5F267E45">
-            <wp:extent cx="3390900" cy="469900"/>
+          <wp:inline distT="0" distB="0" distL="0" distR="0" wp14:anchorId="0D335F73" wp14:editId="06E18776">
+            <wp:extent cx="2489200" cy="596900"/>
             <wp:effectExtent l="0" t="0" r="0" b="0"/>
-            <wp:docPr id="390611168" name="Imagen 1"/>
+            <wp:docPr id="1890694173" name="Imagen 1"/>
             <wp:cNvGraphicFramePr>
               <a:graphicFrameLocks xmlns:a="http://schemas.openxmlformats.org/drawingml/2006/main" noChangeAspect="1"/>
             </wp:cNvGraphicFramePr>
@@ -36,7 +37,7 @@
               <a:graphicData uri="http://schemas.openxmlformats.org/drawingml/2006/picture">
                 <pic:pic xmlns:pic="http://schemas.openxmlformats.org/drawingml/2006/picture">
                   <pic:nvPicPr>
-                    <pic:cNvPr id="390611168" name=""/>
+                    <pic:cNvPr id="1890694173" name=""/>
                     <pic:cNvPicPr/>
                   </pic:nvPicPr>
                   <pic:blipFill>
@@ -48,7 +49,7 @@
                   <pic:spPr>
                     <a:xfrm>
                       <a:off x="0" y="0"/>
-                      <a:ext cx="3390900" cy="469900"/>
+                      <a:ext cx="2489200" cy="596900"/>
                     </a:xfrm>
                     <a:prstGeom prst="rect">
                       <a:avLst/>
@@ -67,11 +68,32 @@
           <w:lang w:val="es-ES_tradnl"/>
         </w:rPr>
       </w:pPr>
+    </w:p>
+    <w:p>
+      <w:pPr>
+        <w:rPr>
+          <w:lang w:val="es-ES_tradnl"/>
+        </w:rPr>
+      </w:pPr>
       <w:r>
         <w:rPr>
           <w:lang w:val="es-ES_tradnl"/>
         </w:rPr>
-        <w:t xml:space="preserve"> </w:t>
+        <w:t>SLIM+N2 (</w:t>
+      </w:r>
+      <w:proofErr w:type="spellStart"/>
+      <w:r>
+        <w:rPr>
+          <w:lang w:val="es-ES_tradnl"/>
+        </w:rPr>
+        <w:t>Normalization</w:t>
+      </w:r>
+      <w:proofErr w:type="spellEnd"/>
+      <w:r>
+        <w:rPr>
+          <w:lang w:val="es-ES_tradnl"/>
+        </w:rPr>
+        <w:t>)</w:t>
       </w:r>
     </w:p>
     <w:p>
@@ -84,113 +106,11 @@
         <w:rPr>
           <w:lang w:val="es-ES_tradnl"/>
         </w:rPr>
-        <w:t xml:space="preserve">SLIM + ABS </w:t>
-      </w:r>
-      <w:proofErr w:type="spellStart"/>
-      <w:r>
-        <w:rPr>
-          <w:lang w:val="es-ES_tradnl"/>
-        </w:rPr>
-        <w:t>with</w:t>
-      </w:r>
-      <w:proofErr w:type="spellEnd"/>
-      <w:r>
-        <w:rPr>
-          <w:lang w:val="es-ES_tradnl"/>
-        </w:rPr>
-        <w:t xml:space="preserve"> OMS</w:t>
-      </w:r>
-      <w:r>
-        <w:rPr>
-          <w:lang w:val="es-ES_tradnl"/>
-        </w:rPr>
-        <w:t>:</w:t>
-      </w:r>
-    </w:p>
-    <w:p>
-      <w:pPr>
-        <w:rPr>
-          <w:lang w:val="es-ES_tradnl"/>
-        </w:rPr>
-      </w:pPr>
-    </w:p>
-    <w:p>
-      <w:pPr>
-        <w:rPr>
-          <w:lang w:val="es-ES_tradnl"/>
-        </w:rPr>
-      </w:pPr>
-    </w:p>
-    <w:p>
-      <w:pPr>
-        <w:rPr>
-          <w:lang w:val="es-ES_tradnl"/>
-        </w:rPr>
-      </w:pPr>
-      <w:r>
-        <w:rPr>
-          <w:lang w:val="es-ES_tradnl"/>
-        </w:rPr>
-        <w:t xml:space="preserve">SLIM + ABS </w:t>
-      </w:r>
-      <w:proofErr w:type="spellStart"/>
-      <w:r>
-        <w:rPr>
-          <w:lang w:val="es-ES_tradnl"/>
-        </w:rPr>
-        <w:t>normalized</w:t>
-      </w:r>
-      <w:proofErr w:type="spellEnd"/>
-      <w:r>
-        <w:rPr>
-          <w:lang w:val="es-ES_tradnl"/>
-        </w:rPr>
-        <w:t xml:space="preserve"> </w:t>
-      </w:r>
-      <w:proofErr w:type="spellStart"/>
-      <w:r>
-        <w:rPr>
-          <w:lang w:val="es-ES_tradnl"/>
-        </w:rPr>
-        <w:t>mutation</w:t>
-      </w:r>
-      <w:proofErr w:type="spellEnd"/>
-      <w:r>
-        <w:rPr>
-          <w:lang w:val="es-ES_tradnl"/>
-        </w:rPr>
-        <w:t xml:space="preserve"> </w:t>
-      </w:r>
-      <w:proofErr w:type="spellStart"/>
-      <w:r>
-        <w:rPr>
-          <w:lang w:val="es-ES_tradnl"/>
-        </w:rPr>
-        <w:t>operator</w:t>
-      </w:r>
-      <w:proofErr w:type="spellEnd"/>
-      <w:r>
-        <w:rPr>
-          <w:lang w:val="es-ES_tradnl"/>
-        </w:rPr>
-        <w:t>:</w:t>
-      </w:r>
-    </w:p>
-    <w:p>
-      <w:pPr>
-        <w:rPr>
-          <w:lang w:val="es-ES_tradnl"/>
-        </w:rPr>
-      </w:pPr>
-      <w:r>
-        <w:rPr>
-          <w:lang w:val="es-ES_tradnl"/>
-        </w:rPr>
         <w:drawing>
-          <wp:inline distT="0" distB="0" distL="0" distR="0" wp14:anchorId="091A39D2" wp14:editId="19219B80">
-            <wp:extent cx="5400040" cy="2167890"/>
-            <wp:effectExtent l="0" t="0" r="0" b="3810"/>
-            <wp:docPr id="632286643" name="Imagen 1"/>
+          <wp:inline distT="0" distB="0" distL="0" distR="0" wp14:anchorId="4F0593D1" wp14:editId="240498FC">
+            <wp:extent cx="3302000" cy="711200"/>
+            <wp:effectExtent l="0" t="0" r="0" b="0"/>
+            <wp:docPr id="429821599" name="Imagen 1"/>
             <wp:cNvGraphicFramePr>
               <a:graphicFrameLocks xmlns:a="http://schemas.openxmlformats.org/drawingml/2006/main" noChangeAspect="1"/>
             </wp:cNvGraphicFramePr>
@@ -198,7 +118,7 @@
               <a:graphicData uri="http://schemas.openxmlformats.org/drawingml/2006/picture">
                 <pic:pic xmlns:pic="http://schemas.openxmlformats.org/drawingml/2006/picture">
                   <pic:nvPicPr>
-                    <pic:cNvPr id="632286643" name=""/>
+                    <pic:cNvPr id="429821599" name=""/>
                     <pic:cNvPicPr/>
                   </pic:nvPicPr>
                   <pic:blipFill>
@@ -210,7 +130,7 @@
                   <pic:spPr>
                     <a:xfrm>
                       <a:off x="0" y="0"/>
-                      <a:ext cx="5400040" cy="2167890"/>
+                      <a:ext cx="3302000" cy="711200"/>
                     </a:xfrm>
                     <a:prstGeom prst="rect">
                       <a:avLst/>
@@ -236,11 +156,32 @@
           <w:lang w:val="es-ES_tradnl"/>
         </w:rPr>
       </w:pPr>
+    </w:p>
+    <w:p>
+      <w:pPr>
+        <w:rPr>
+          <w:lang w:val="es-ES_tradnl"/>
+        </w:rPr>
+      </w:pPr>
       <w:r>
         <w:rPr>
           <w:lang w:val="es-ES_tradnl"/>
         </w:rPr>
-        <w:t>Donde:</w:t>
+        <w:t>SLIM+N1 (</w:t>
+      </w:r>
+      <w:proofErr w:type="spellStart"/>
+      <w:r>
+        <w:rPr>
+          <w:lang w:val="es-ES_tradnl"/>
+        </w:rPr>
+        <w:t>Standarization</w:t>
+      </w:r>
+      <w:proofErr w:type="spellEnd"/>
+      <w:r>
+        <w:rPr>
+          <w:lang w:val="es-ES_tradnl"/>
+        </w:rPr>
+        <w:t>)</w:t>
       </w:r>
     </w:p>
     <w:p>
@@ -254,10 +195,10 @@
           <w:lang w:val="es-ES_tradnl"/>
         </w:rPr>
         <w:drawing>
-          <wp:inline distT="0" distB="0" distL="0" distR="0" wp14:anchorId="730E08FE" wp14:editId="082A5B1F">
-            <wp:extent cx="5400040" cy="2534285"/>
-            <wp:effectExtent l="0" t="0" r="0" b="5715"/>
-            <wp:docPr id="506592754" name="Imagen 1"/>
+          <wp:inline distT="0" distB="0" distL="0" distR="0" wp14:anchorId="5A4B7090" wp14:editId="1B2A2F8A">
+            <wp:extent cx="2908300" cy="736600"/>
+            <wp:effectExtent l="0" t="0" r="0" b="0"/>
+            <wp:docPr id="1929714652" name="Imagen 1"/>
             <wp:cNvGraphicFramePr>
               <a:graphicFrameLocks xmlns:a="http://schemas.openxmlformats.org/drawingml/2006/main" noChangeAspect="1"/>
             </wp:cNvGraphicFramePr>
@@ -265,7 +206,7 @@
               <a:graphicData uri="http://schemas.openxmlformats.org/drawingml/2006/picture">
                 <pic:pic xmlns:pic="http://schemas.openxmlformats.org/drawingml/2006/picture">
                   <pic:nvPicPr>
-                    <pic:cNvPr id="506592754" name=""/>
+                    <pic:cNvPr id="1929714652" name=""/>
                     <pic:cNvPicPr/>
                   </pic:nvPicPr>
                   <pic:blipFill>
@@ -277,7 +218,7 @@
                   <pic:spPr>
                     <a:xfrm>
                       <a:off x="0" y="0"/>
-                      <a:ext cx="5400040" cy="2534285"/>
+                      <a:ext cx="2908300" cy="736600"/>
                     </a:xfrm>
                     <a:prstGeom prst="rect">
                       <a:avLst/>
@@ -289,6 +230,20 @@
           </wp:inline>
         </w:drawing>
       </w:r>
+    </w:p>
+    <w:p>
+      <w:pPr>
+        <w:rPr>
+          <w:lang w:val="es-ES_tradnl"/>
+        </w:rPr>
+      </w:pPr>
+    </w:p>
+    <w:p>
+      <w:pPr>
+        <w:rPr>
+          <w:lang w:val="es-ES_tradnl"/>
+        </w:rPr>
+      </w:pPr>
     </w:p>
     <w:sectPr>
       <w:pgSz w:w="11906" w:h="16838"/>

</xml_diff>